<commit_message>
eat: download of object occurrence document
</commit_message>
<xml_diff>
--- a/vitarerum-api/app/use_of_collections/infrastructure/templates/roc_object_occurrence.docx
+++ b/vitarerum-api/app/use_of_collections/infrastructure/templates/roc_object_occurrence.docx
@@ -437,7 +437,7 @@
                 <w:sz w:val="20"/>
                 <w:szCs w:val="20"/>
               </w:rPr>
-              <w:t>Coleção</w:t>
+              <w:t>{%tr for occurrence in occurrences %}</w:t>
             </w:r>
           </w:p>
         </w:tc>
@@ -461,7 +461,54 @@
                 <w:sz w:val="20"/>
                 <w:szCs w:val="20"/>
               </w:rPr>
-              <w:t>{{ collection }}</w:t>
+            </w:r>
+          </w:p>
+        </w:tc>
+      </w:tr>
+      <w:tr>
+        <w:tc>
+          <w:tcPr>
+            <w:tcW w:w="2093" w:type="dxa"/>
+          </w:tcPr>
+          <w:p>
+            <w:pPr>
+              <w:rPr>
+                <w:rFonts w:ascii="Corbel" w:hAnsi="Corbel" w:cs="Courier"/>
+                <w:sz w:val="20"/>
+                <w:szCs w:val="20"/>
+              </w:rPr>
+            </w:pPr>
+            <w:r>
+              <w:rPr>
+                <w:rFonts w:ascii="Corbel" w:hAnsi="Corbel" w:cs="Courier"/>
+                <w:sz w:val="20"/>
+                <w:szCs w:val="20"/>
+              </w:rPr>
+              <w:t>Coleção</w:t>
+            </w:r>
+          </w:p>
+        </w:tc>
+        <w:tc>
+          <w:tcPr>
+            <w:tcW w:w="6423" w:type="dxa"/>
+          </w:tcPr>
+          <w:p>
+            <w:pPr>
+              <w:rPr>
+                <w:rFonts w:ascii="Corbel" w:hAnsi="Corbel" w:cs="Courier"/>
+                <w:sz w:val="20"/>
+                <w:szCs w:val="20"/>
+              </w:rPr>
+            </w:pPr>
+            <w:proofErr w:type="spellStart"/>
+            <w:proofErr w:type="spellEnd"/>
+            <w:r>
+              <w:rPr>
+                <w:rFonts w:ascii="Corbel" w:hAnsi="Corbel" w:cs="Courier"/>
+                <w:sz w:val="20"/>
+                <w:szCs w:val="20"/>
+              </w:rPr>
+              <w:t>{{ occurrence.collection }}</w:t>
             </w:r>
           </w:p>
         </w:tc>
@@ -550,7 +597,7 @@
                 <w:sz w:val="20"/>
                 <w:szCs w:val="20"/>
               </w:rPr>
-              <w:t>{{ designation }}</w:t>
+              <w:t>{{ occurrence.designation }}</w:t>
             </w:r>
           </w:p>
         </w:tc>
@@ -612,7 +659,7 @@
                 <w:sz w:val="20"/>
                 <w:szCs w:val="20"/>
               </w:rPr>
-              <w:t>{{ inventory_numbers }}</w:t>
+              <w:t>{{ occurrence.inventory_numbers }}</w:t>
             </w:r>
           </w:p>
         </w:tc>
@@ -658,7 +705,7 @@
                 <w:sz w:val="20"/>
                 <w:szCs w:val="20"/>
               </w:rPr>
-              <w:t>{{ occurrence_date }}</w:t>
+              <w:t>{{ occurrence.occurrence_date }}</w:t>
             </w:r>
           </w:p>
         </w:tc>
@@ -704,7 +751,7 @@
                 <w:sz w:val="20"/>
                 <w:szCs w:val="20"/>
               </w:rPr>
-              <w:t>{{ location }}</w:t>
+              <w:t>{{ occurrence.location }}</w:t>
             </w:r>
           </w:p>
         </w:tc>
@@ -750,7 +797,7 @@
                 <w:sz w:val="20"/>
                 <w:szCs w:val="20"/>
               </w:rPr>
-              <w:t>{{ detailed_description }}</w:t>
+              <w:t>{{ occurrence.detailed_description }}</w:t>
             </w:r>
           </w:p>
         </w:tc>
@@ -796,7 +843,7 @@
                 <w:sz w:val="20"/>
                 <w:szCs w:val="20"/>
               </w:rPr>
-              <w:t>{{ testimonial }}</w:t>
+              <w:t>{{ occurrence.testimonial }}</w:t>
             </w:r>
           </w:p>
         </w:tc>
@@ -842,7 +889,52 @@
                 <w:sz w:val="20"/>
                 <w:szCs w:val="20"/>
               </w:rPr>
-              <w:t>{{ images }}</w:t>
+              <w:t>{{ occurrence.images }}</w:t>
+            </w:r>
+          </w:p>
+        </w:tc>
+      </w:tr>
+      <w:tr>
+        <w:tc>
+          <w:tcPr>
+            <w:tcW w:w="2093" w:type="dxa"/>
+          </w:tcPr>
+          <w:p>
+            <w:pPr>
+              <w:rPr>
+                <w:rFonts w:ascii="Corbel" w:hAnsi="Corbel" w:cs="Courier"/>
+                <w:sz w:val="20"/>
+                <w:szCs w:val="20"/>
+              </w:rPr>
+            </w:pPr>
+            <w:r>
+              <w:rPr>
+                <w:rFonts w:ascii="Corbel" w:hAnsi="Corbel" w:cs="Courier"/>
+                <w:sz w:val="20"/>
+                <w:szCs w:val="20"/>
+              </w:rPr>
+              <w:t>{%tr endfor %}</w:t>
+            </w:r>
+          </w:p>
+        </w:tc>
+        <w:tc>
+          <w:tcPr>
+            <w:tcW w:w="6423" w:type="dxa"/>
+          </w:tcPr>
+          <w:p>
+            <w:pPr>
+              <w:rPr>
+                <w:rFonts w:ascii="Corbel" w:hAnsi="Corbel" w:cs="Courier"/>
+                <w:sz w:val="20"/>
+                <w:szCs w:val="20"/>
+              </w:rPr>
+            </w:pPr>
+            <w:r>
+              <w:rPr>
+                <w:rFonts w:ascii="Corbel" w:hAnsi="Corbel" w:cs="Courier"/>
+                <w:sz w:val="20"/>
+                <w:szCs w:val="20"/>
+              </w:rPr>
             </w:r>
           </w:p>
         </w:tc>

</xml_diff>